<commit_message>
ISO W10 audit pointer retroaktif: COM-REG-01, MKT-REG-01, FAT-RPT-02
COM-REG-01: 3 rujukan dikembalikan, 1 dilengkapi (butir 4.12). MKT-REG-01: 2 dikembalikan, 2 dilengkapi (butir 4.4, 4.10). Fakta tambahan dicek worker terhadap bed1bb6.

Co-Authored-By: Claude Opus 5.5 <noreply@anthropic.com>
Claude-Session: https://claude.ai/code/session_01BhkCQM7h3krZb9kjY2Nate
</commit_message>
<xml_diff>
--- a/out/05_Commercial/SNX-COM-REG-01 Customer Feedback & Complaint Register (Rev00 DRAFT).docx
+++ b/out/05_Commercial/SNX-COM-REG-01 Customer Feedback & Complaint Register (Rev00 DRAFT).docx
@@ -4756,7 +4756,7 @@
                 <w:sz w:val="24"/>
                 <w:szCs w:val="24"/>
               </w:rPr>
-              <w:t>Pemilik dan pengelola register. Menunjuk PIC, menetapkan status Selesai, menetapkan apakah suatu keluhan kritis, menerima eskalasi keluhan kritis, dan mengeskalasi keluhan kepada COO.</w:t>
+              <w:t>Pemilik dan pengelola register. Menunjuk PIC, menetapkan status Selesai, menetapkan apakah suatu keluhan kritis, menerima eskalasi keluhan kritis, dan mengeskalasi keluhan kepada COO sesuai butir 4.11.</w:t>
             </w:r>
           </w:p>
         </w:tc>
@@ -4992,7 +4992,7 @@
           <w:sz w:val="24"/>
           <w:szCs w:val="24"/>
         </w:rPr>
-        <w:t xml:space="preserve">6.2 Tulis satu baris di Tabel 1 untuk setiap feedback atau keluhan yang diterima.</w:t>
+        <w:t xml:space="preserve">6.2 Tulis satu baris di Tabel 1 untuk setiap feedback atau keluhan yang diterima, sesuai butir 4.1.</w:t>
       </w:r>
     </w:p>
     <w:p>
@@ -5328,7 +5328,7 @@
           <w:sz w:val="24"/>
           <w:szCs w:val="24"/>
         </w:rPr>
-        <w:t xml:space="preserve">6.16 Saat keluhan dieskalasi, tulis alasan eskalasi, tujuan eskalasi, dan tanggalnya di Tabel 4.</w:t>
+        <w:t xml:space="preserve">6.16 Saat keluhan dieskalasi sesuai butir 4.9 sampai 4.11, tulis alasan eskalasi, tujuan eskalasi, dan tanggalnya di Tabel 4.</w:t>
       </w:r>
     </w:p>
     <w:p>
@@ -12970,7 +12970,7 @@
                 <w:sz w:val="24"/>
                 <w:szCs w:val="24"/>
               </w:rPr>
-              <w:t>Folder Google Drive departemen Commercial. Pemilik dan pengelola: VP Commercial. Pencatat: Business Development. Klasifikasi RESTRICTED (Internal) setelah berisi data customer (USULAN).</w:t>
+              <w:t>Folder Google Drive departemen Commercial. Pemilik dan pengelola: VP Commercial. Pencatat: Business Development. Klasifikasi INTERNAL selama kosong dan RESTRICTED (Internal) setelah berisi data customer (USULAN).</w:t>
             </w:r>
           </w:p>
         </w:tc>

</xml_diff>